<commit_message>
test: add numeric guard retry logic and exact raw value grounding
- Add _grounded() support for exact raw values (₹2,39,53,022.37) alongside display forms (₹2.40 Cr)
- Add numeric guard retry: model gets one correction attempt when inventing figures, then falls back to evidence-only summary
- Add _safe_summary() generating grounded fallback from evidence when model keeps inventing
- Add should_use() replacing enabled() — agent is default when model configured; opt out with AGENT_MODE=0
- Canon
</commit_message>
<xml_diff>
--- a/docs/vinayak/The_Business_IDE_BIDE.docx
+++ b/docs/vinayak/The_Business_IDE_BIDE.docx
@@ -8803,7 +8803,7 @@
           <w:sz w:val="22"/>
           <w:szCs w:val="22"/>
         </w:rPr>
-        <w:t xml:space="preserve">Layer 3 — The Canonical Model  ·  Status: PARTIAL</w:t>
+        <w:t>Layer 3 — The Canonical Model  ·  Status: MOSTLY BUILT</w:t>
       </w:r>
     </w:p>
     <w:p>
@@ -9296,7 +9296,7 @@
           <w:sz w:val="22"/>
           <w:szCs w:val="22"/>
         </w:rPr>
-        <w:t xml:space="preserve">Layer 5 — Memory  ·  Status: PARTIAL</w:t>
+        <w:t>Layer 5 — Memory  ·  Status: MOSTLY BUILT</w:t>
       </w:r>
     </w:p>
     <w:p>
@@ -9716,7 +9716,7 @@
           <w:sz w:val="22"/>
           <w:szCs w:val="22"/>
         </w:rPr>
-        <w:t xml:space="preserve">Layer 7 — Tools (the first all-new layer)  ·  Status: TO BUILD</w:t>
+        <w:t>Layer 7 — Tools  ·  Status: PARTIAL (read tools built; actions next)</w:t>
       </w:r>
     </w:p>
     <w:p>
@@ -9987,7 +9987,7 @@
           <w:sz w:val="22"/>
           <w:szCs w:val="22"/>
         </w:rPr>
-        <w:t xml:space="preserve">Layer 8 — The Agent Core  ·  Status: TO BUILD</w:t>
+        <w:t>Layer 8 — The Agent Core  ·  Status: PARTIAL (first cut live — grounded tool-use loop)</w:t>
       </w:r>
     </w:p>
     <w:p>
@@ -10033,7 +10033,7 @@
           <w:sz w:val="22"/>
           <w:szCs w:val="22"/>
         </w:rPr>
-        <w:t xml:space="preserve">Layer 9 — The Action Spine &amp; Human-in-the-Loop  ·  Status: TO BUILD</w:t>
+        <w:t>Layer 9 — The Action Spine &amp; Human-in-the-Loop  ·  Status: PARTIAL (first action live)</w:t>
       </w:r>
     </w:p>
     <w:p>
@@ -10079,7 +10079,7 @@
           <w:sz w:val="22"/>
           <w:szCs w:val="22"/>
         </w:rPr>
-        <w:t xml:space="preserve">Layer 10 — Workflows &amp; the Synapse Bus (the actual brain)  ·  Status: TO BUILD</w:t>
+        <w:t>Layer 10 — Workflows &amp; the Synapse Bus (the actual brain)  ·  Status: SEEDED (events table only)</w:t>
       </w:r>
     </w:p>
     <w:p>
@@ -10161,6 +10161,486 @@
     <w:p>
       <w:r>
         <w:br w:type="page"/>
+      </w:r>
+    </w:p>
+    <w:p>
+      <w:pPr>
+        <w:pStyle w:val="Heading1"/>
+      </w:pPr>
+      <w:r>
+        <w:t>Part 1A — The Finalized Architecture: Stable Core, Pluggable Edges</w:t>
+      </w:r>
+    </w:p>
+    <w:p>
+      <w:r>
+        <w:t>This part is the finalized, complete-product architecture. Everything in Parts 2–11 implements it; nothing in it changes as verticals are added. Earlier sections describe the build in phases; this part describes the invariant — the small set of contracts that are expensive to change and are therefore frozen now, and the larger set of things that are deliberately swappable so the product can grow (new sources, new tools, new workflows, even a different orchestration engine or model) without a single change to the core. If a future decision would force a change to a frozen contract, the decision is wrong, not the contract.</w:t>
+      </w:r>
+    </w:p>
+    <w:p>
+      <w:pPr>
+        <w:pStyle w:val="Heading2"/>
+      </w:pPr>
+      <w:r>
+        <w:t>1A.1 What we are building (the aim, restated precisely)</w:t>
+      </w:r>
+    </w:p>
+    <w:p>
+      <w:r>
+        <w:t>BIDE is a business brain: an operating system that takes a company's real operational data out of the ERPs and spreadsheets it is trapped in, turns it into one clean normalised model, reasons over that model with calibrated confidence and cited evidence, remembers what it learns about the business, and — with a human in the loop for anything that moves money or files with a regulator — takes action. The chat box is one window onto this brain, not the brain itself.</w:t>
+      </w:r>
+    </w:p>
+    <w:p>
+      <w:r>
+        <w:t>The product exists to serve three promises, and every capability must serve one of them. It answers truthfully: a number is never stated unless it was computed from the company's own data and can be cited. It compounds: owner-confirmed knowledge — terms, trust, seasonality, what a SKU really is — accumulates and makes every later answer better. And it acts safely: autonomy is earned through a confidence gate, and money and regulator actions always terminate at a person. Trust, memory, and safe autonomy are the product; the dashboard is only the hook that proves it works.</w:t>
+      </w:r>
+    </w:p>
+    <w:p>
+      <w:r>
+        <w:t>The first vertical is Finance &amp; Accounts because that is where the data is richest and the truth-test is sharpest. But the architecture is built for all thirteen business fields from the start — the finance vertical is the first tenant of a structure designed to hold twelve more without redesign.</w:t>
+      </w:r>
+    </w:p>
+    <w:p>
+      <w:pPr>
+        <w:pStyle w:val="Heading2"/>
+      </w:pPr>
+      <w:r>
+        <w:t>1A.2 The operating model — one loop behind every surface</w:t>
+      </w:r>
+    </w:p>
+    <w:p>
+      <w:r>
+        <w:t>There is exactly one control loop in the system, and every feature is an instance of it pointed at different data: Trigger → Gather → Reason → Gate → Act → Remember. A question typed into chat, an event emitted when a payment lands, and a 3 a.m. scheduled sync are three different triggers into the same loop. This is the most important design commitment in the product: because there is one loop, there is one place to enforce grounding, one place to enforce the confidence gate, and one place to write memory. Adding a capability therefore never means adding a new way for the system to behave — only a new trigger, a new tool, or a new workflow definition handed to the loop that already exists.</w:t>
+      </w:r>
+    </w:p>
+    <w:p>
+      <w:pPr>
+        <w:pStyle w:val="ListParagraph"/>
+      </w:pPr>
+      <w:r>
+        <w:t>•  Trigger — a person asks, an event fires, or a schedule runs.</w:t>
+      </w:r>
+    </w:p>
+    <w:p>
+      <w:pPr>
+        <w:pStyle w:val="ListParagraph"/>
+      </w:pPr>
+      <w:r>
+        <w:t>•  Gather — the brain reads only through tools, turning raw data into tagged, cited evidence. It never touches the database directly.</w:t>
+      </w:r>
+    </w:p>
+    <w:p>
+      <w:pPr>
+        <w:pStyle w:val="ListParagraph"/>
+      </w:pPr>
+      <w:r>
+        <w:t>•  Reason — it forms claims, each labelled computed, inference, or unknown; a computed claim must cite an evidence id.</w:t>
+      </w:r>
+    </w:p>
+    <w:p>
+      <w:pPr>
+        <w:pStyle w:val="ListParagraph"/>
+      </w:pPr>
+      <w:r>
+        <w:t>•  Gate — deterministic code, not the model, decides how sure the system is and what it may do with that certainty.</w:t>
+      </w:r>
+    </w:p>
+    <w:p>
+      <w:pPr>
+        <w:pStyle w:val="ListParagraph"/>
+      </w:pPr>
+      <w:r>
+        <w:t>•  Act — it answers, or proposes an action; money and regulator actions are proposed only, never executed, until a person approves.</w:t>
+      </w:r>
+    </w:p>
+    <w:p>
+      <w:pPr>
+        <w:pStyle w:val="ListParagraph"/>
+      </w:pPr>
+      <w:r>
+        <w:t>•  Remember — the full pass (trigger, tools, evidence, outcome) is written back so the next pass is better informed.</w:t>
+      </w:r>
+    </w:p>
+    <w:p>
+      <w:pPr>
+        <w:pStyle w:val="Heading2"/>
+      </w:pPr>
+      <w:r>
+        <w:t>1A.3 The stable core and the pluggable edges</w:t>
+      </w:r>
+    </w:p>
+    <w:p>
+      <w:r>
+        <w:t>The architecture is a small frozen core surrounded by deliberately replaceable edges. The core is the set of contracts that everything depends on and that are ruinous to change once data and tools exist; they are specified once, here, and then never broken. The edges are where all growth happens; each can change, be added to, or be swapped for a different technology without the core noticing.</w:t>
+      </w:r>
+    </w:p>
+    <w:p>
+      <w:pPr>
+        <w:pStyle w:val="Heading3"/>
+      </w:pPr>
+      <w:r>
+        <w:t>The frozen core (eight contracts)</w:t>
+      </w:r>
+    </w:p>
+    <w:p>
+      <w:pPr>
+        <w:pStyle w:val="ListParagraph"/>
+      </w:pPr>
+      <w:r>
+        <w:t>•  The canonical model — Customer, Invoice, SKU, Payment, GL, Order and the rest: the one language every part of the brain speaks, independent of which source the data came from. New sources map into it; it does not bend to them.</w:t>
+      </w:r>
+    </w:p>
+    <w:p>
+      <w:pPr>
+        <w:pStyle w:val="ListParagraph"/>
+      </w:pPr>
+      <w:r>
+        <w:t>•  The evidence contract — every figure the brain uses is an Evidence record (stable id, label, raw value, display form, provenance). Grounding, citation, and the numeric guard all stand on this; it is the most load-bearing object in the system.</w:t>
+      </w:r>
+    </w:p>
+    <w:p>
+      <w:pPr>
+        <w:pStyle w:val="ListParagraph"/>
+      </w:pPr>
+      <w:r>
+        <w:t>•  The tool contract — the only door between the AI and the data: a typed name, inputs (company_id injected by the layer, never chosen by the model), a returns shape that is pre-aggregated and capped, a side-effect class (read | writes | moves_money | files_regulator), and quality signals the gate reads. No tool both reads and writes.</w:t>
+      </w:r>
+    </w:p>
+    <w:p>
+      <w:pPr>
+        <w:pStyle w:val="ListParagraph"/>
+      </w:pPr>
+      <w:r>
+        <w:t>•  The safety spine — grounding, the numeric guard, and the confidence/action authorizer as one deterministic module that lives outside any orchestrator. It is why honesty is structural, not prompted, and every orchestrator and vertical reuses the identical spine.</w:t>
+      </w:r>
+    </w:p>
+    <w:p>
+      <w:pPr>
+        <w:pStyle w:val="ListParagraph"/>
+      </w:pPr>
+      <w:r>
+        <w:t>•  The AgentRunner port — a single interface, run(trigger, context) → Answer, behind which the orchestration engine lives. Today's implementation is an owned, thin tool-use loop; the port is what keeps that engine swappable forever.</w:t>
+      </w:r>
+    </w:p>
+    <w:p>
+      <w:pPr>
+        <w:pStyle w:val="ListParagraph"/>
+      </w:pPr>
+      <w:r>
+        <w:t>•  The memory schema — the business profile, durable facts (which supersede and decay), entity summaries, conversation threads, and the episodic log: distinct stores with distinct rules, never conflated.</w:t>
+      </w:r>
+    </w:p>
+    <w:p>
+      <w:pPr>
+        <w:pStyle w:val="ListParagraph"/>
+      </w:pPr>
+      <w:r>
+        <w:t>•  The event contract — a typed event (type, entity reference, payload, tenancy, processed marker) on a shared bus: the mechanism by which one field's change wakes another field's workflow.</w:t>
+      </w:r>
+    </w:p>
+    <w:p>
+      <w:pPr>
+        <w:pStyle w:val="ListParagraph"/>
+      </w:pPr>
+      <w:r>
+        <w:t>•  Tenancy and provenance invariants — every row and every tool result carries its company scope, its source, and its freshness; company_id is injected by the layer and is never a model-chosen parameter. These hold in every layer, without exception.</w:t>
+      </w:r>
+    </w:p>
+    <w:p>
+      <w:pPr>
+        <w:pStyle w:val="Heading3"/>
+      </w:pPr>
+      <w:r>
+        <w:t>The pluggable edges (where all growth happens)</w:t>
+      </w:r>
+    </w:p>
+    <w:p>
+      <w:pPr>
+        <w:pStyle w:val="ListParagraph"/>
+      </w:pPr>
+      <w:r>
+        <w:t>•  Source adapters — Tranzact today; Zoho, Tally, Busy, email, CSV/API next. Each implements the same extract→map→load contract and maps into the canonical model. Adding a source touches no layer above ingestion.</w:t>
+      </w:r>
+    </w:p>
+    <w:p>
+      <w:pPr>
+        <w:pStyle w:val="ListParagraph"/>
+      </w:pPr>
+      <w:r>
+        <w:t>•  Tools — new read and action tools per vertical, each declared against the frozen tool contract. A vertical is, to a first approximation, its set of tools.</w:t>
+      </w:r>
+    </w:p>
+    <w:p>
+      <w:pPr>
+        <w:pStyle w:val="ListParagraph"/>
+      </w:pPr>
+      <w:r>
+        <w:t>•  The orchestration engine — the owned loop is the default AgentRunner implementation. LangGraph or Google ADK become alternative implementations behind the same port, adopted only if and when multi-agent handoffs or durable long-running workflow state justify them. Adopting one is then a contained adapter swap, covered by the eval harness, with zero change to tools, evidence, memory, or gates.</w:t>
+      </w:r>
+    </w:p>
+    <w:p>
+      <w:pPr>
+        <w:pStyle w:val="ListParagraph"/>
+      </w:pPr>
+      <w:r>
+        <w:t>•  The model — reached through a narrow model port (chat-with-tools, plus fast and smart tiers). Anthropic's Claude via native tool-use is today's implementation; the port keeps the product from being welded to one provider.</w:t>
+      </w:r>
+    </w:p>
+    <w:p>
+      <w:pPr>
+        <w:pStyle w:val="ListParagraph"/>
+      </w:pPr>
+      <w:r>
+        <w:t>•  Workflows — declarative definitions (trigger, tools, gate policy, action), stored as data. New workflows are new rows, not new code.</w:t>
+      </w:r>
+    </w:p>
+    <w:p>
+      <w:pPr>
+        <w:pStyle w:val="ListParagraph"/>
+      </w:pPr>
+      <w:r>
+        <w:t>•  External exposure via MCP — the same tool registry can be published as an MCP server so the business becomes a callable tool for approved external clients, company identity still injected by the layer. MCP is a transport added when third parties need it, not a rewrite of how tools work.</w:t>
+      </w:r>
+    </w:p>
+    <w:p>
+      <w:pPr>
+        <w:pStyle w:val="Heading2"/>
+      </w:pPr>
+      <w:r>
+        <w:t>1A.4 The chat architecture</w:t>
+      </w:r>
+    </w:p>
+    <w:p>
+      <w:r>
+        <w:t>Chat is the trigger surface most people see, so its internals are specified here even though, architecturally, it is just one way into the universal loop. A question enters through the security boundary: the browser talks only to the same-origin proxy, which forwards server-to-server with the internal key and the workspace id, so the backend is never exposed to the browser. The workspace scope is resolved and every subsequent read is filtered by company_id.</w:t>
+      </w:r>
+    </w:p>
+    <w:p>
+      <w:r>
+        <w:t>Inside the loop, the AgentRunner assembles context — the business profile, the relevant durable facts, entity summaries, and the recent turns of the thread — then lets the model call read tools to gather cited evidence. The model may gather over several passes but never sees the database, only tool results. When it produces an answer, the safety spine runs: every rupee figure must trace to a tool's evidence, in either its rounded display or its exact raw value; a figure that does not trace triggers one self-correcting retry and, failing that, falls back to an evidence-only answer that never surfaces an invented number. The answer carries a confidence label and the list of tools it used.</w:t>
+      </w:r>
+    </w:p>
+    <w:p>
+      <w:r>
+        <w:t>Response quality and cost are architectural, not incidental. The stable prompt prefix — system instructions, business profile, tool schemas — is cached so repeat turns are cheap. Cheap tool-gathering steps run on the fast model; only judgment and final phrasing escalate to the strong model. Tool results are capped (top-N rows, bounded payloads) before they reach the model. The loop is bounded, and if no model is configured or a model call fails, a deterministic path answers from the same tools, so the chat never hard-fails. Multi-turn is handled by carrying recent turns and rewriting a follow-up into a standalone question before it enters the loop, so a follow-up flows through the same grounding and gate as any other question and adds no new way to invent a number.</w:t>
+      </w:r>
+    </w:p>
+    <w:p>
+      <w:pPr>
+        <w:pStyle w:val="Heading2"/>
+      </w:pPr>
+      <w:r>
+        <w:t>1A.5 The memory architecture</w:t>
+      </w:r>
+    </w:p>
+    <w:p>
+      <w:r>
+        <w:t>Memory is the compounding asset and therefore the part most carefully separated. Live data is rented from the source system and refreshes; memory is ours and grows. Five distinct stores, never conflated, each with its own rule:</w:t>
+      </w:r>
+    </w:p>
+    <w:p>
+      <w:pPr>
+        <w:pStyle w:val="ListParagraph"/>
+      </w:pPr>
+      <w:r>
+        <w:t>•  The business profile — seeded at onboarding (industry, sub-vertical, fiscal year, healthy-margin benchmark, seasonality). Slow-changing context every answer can lean on.</w:t>
+      </w:r>
+    </w:p>
+    <w:p>
+      <w:pPr>
+        <w:pStyle w:val="ListParagraph"/>
+      </w:pPr>
+      <w:r>
+        <w:t>•  Durable facts — owner-confirmed truths (a customer's real payment terms, a SKU's true identity, a trust judgement). A new value retires the old one so there is always exactly one current truth; a fact goes stale on a time expiry or a contradiction with live data, and a stale fact is flagged, not deleted, so the brain re-asks.</w:t>
+      </w:r>
+    </w:p>
+    <w:p>
+      <w:pPr>
+        <w:pStyle w:val="ListParagraph"/>
+      </w:pPr>
+      <w:r>
+        <w:t>•  Entity summaries — the reason-once-at-ingest understanding of a customer, vendor, or SKU, computed when data lands and refreshed after each canonical rebuild, so questions consult pre-built understanding instead of re-deriving it.</w:t>
+      </w:r>
+    </w:p>
+    <w:p>
+      <w:pPr>
+        <w:pStyle w:val="ListParagraph"/>
+      </w:pPr>
+      <w:r>
+        <w:t>•  Conversation threads — each ask turn saved and scoped to the user and brand, powering multi-turn continuity.</w:t>
+      </w:r>
+    </w:p>
+    <w:p>
+      <w:pPr>
+        <w:pStyle w:val="ListParagraph"/>
+      </w:pPr>
+      <w:r>
+        <w:t>•  The episodic log — the full record of every loop (trigger, tools, evidence, decision, outcome). It is the substrate for learning and the audit trail, and it is written from day one so history is never back-filled.</w:t>
+      </w:r>
+    </w:p>
+    <w:p>
+      <w:r>
+        <w:t>These feed the loop as context before it reasons and are written back after it acts — the Remember beat. Learning compounds along two tracks. Passively, confirmed facts and entity summaries accumulate, so the same question asked next month is answered against a richer picture. Proactively, the episodic log plus the event bus let the system notice patterns and speak first — surfacing that a customer is stretching payments before anyone asks — rather than only answering when asked. A document/knowledge plane (semantic retrieval plus a lightweight relationship graph) attaches here for verticals that reason over contracts, tickets, and specs; it is an edge that plugs into the same memory contract, not a change to it.</w:t>
+      </w:r>
+    </w:p>
+    <w:p>
+      <w:pPr>
+        <w:pStyle w:val="Heading2"/>
+      </w:pPr>
+      <w:r>
+        <w:t>1A.6 The technology decisions, finalized</w:t>
+      </w:r>
+    </w:p>
+    <w:p>
+      <w:r>
+        <w:t>These are settled, not open. They are chosen so that the parts that are expensive to change are owned and thin, and the parts that churn — frameworks, models, transports — sit behind ports.</w:t>
+      </w:r>
+    </w:p>
+    <w:p>
+      <w:pPr>
+        <w:pStyle w:val="ListParagraph"/>
+      </w:pPr>
+      <w:r>
+        <w:t>•  Model access: the Anthropic SDK's native tool-use, behind a model port with fast and smart tiers. No agent framework is required to call a model and run tools; that is a few dozen lines and we own them.</w:t>
+      </w:r>
+    </w:p>
+    <w:p>
+      <w:pPr>
+        <w:pStyle w:val="ListParagraph"/>
+      </w:pPr>
+      <w:r>
+        <w:t>•  Orchestration: an owned, thin tool-use loop is the default AgentRunner. LangGraph and Google ADK are not adopted now — not because they are bad, but because the loop is the cheapest, least defensible code in the system, and coupling the foundation to a young external framework is the opposite of future-proof. Because the AgentRunner port exists from day one, either can be dropped in later as an adapter, for genuine multi-agent or durable-workflow needs, without disturbing the core.</w:t>
+      </w:r>
+    </w:p>
+    <w:p>
+      <w:pPr>
+        <w:pStyle w:val="ListParagraph"/>
+      </w:pPr>
+      <w:r>
+        <w:t>•  Tools: in-process functions declared against the tool contract, exposed to the model through the model port. The same registry is publishable as an MCP server when external clients must reuse it — MCP is an added transport, never a reason to rewrite a tool.</w:t>
+      </w:r>
+    </w:p>
+    <w:p>
+      <w:pPr>
+        <w:pStyle w:val="ListParagraph"/>
+      </w:pPr>
+      <w:r>
+        <w:t>•  Safety: the grounding guard, numeric guard, and confidence/action authorizer are a standalone deterministic module, not logic buried inside the loop, so every orchestrator and vertical inherits identical guarantees.</w:t>
+      </w:r>
+    </w:p>
+    <w:p>
+      <w:pPr>
+        <w:pStyle w:val="ListParagraph"/>
+      </w:pPr>
+      <w:r>
+        <w:t>•  The scoreboard: an eval harness is the compiler for a system that has no compiler. It holds real owner questions with hand-verified answers, measures against the raw-dump baseline, and ship-blocks any build that states an uncited number or utters a banned phrase. It grades the deterministic path and the agent path alike, and it grows with every vertical.</w:t>
+      </w:r>
+    </w:p>
+    <w:p>
+      <w:pPr>
+        <w:pStyle w:val="Heading2"/>
+      </w:pPr>
+      <w:r>
+        <w:t>1A.7 The guarantee: adding a vertical changes no core</w:t>
+      </w:r>
+    </w:p>
+    <w:p>
+      <w:r>
+        <w:t>The point of drawing a frozen core and pluggable edges is one testable promise: bringing a new business field online — Sales, Inventory, Support, Legal, and the rest — requires only edge work. Concretely, a new vertical is a set of source mappings into the existing canonical model, a set of tools declared against the existing tool contract, a set of declarative workflow definitions, and a set of eval cases. It adds no new control loop, no new grounding path, no new gate, and no new memory rule. If bringing up a vertical ever seems to require changing one of the eight core contracts, that is the signal that the vertical is being modelled wrong — the core is the fixed point the whole product is designed around.</w:t>
+      </w:r>
+    </w:p>
+    <w:p>
+      <w:r>
+        <w:t>The thirteen fields become one brain, not thirteen tools, through the event bus: a change in one field (an invoice falls overdue in Finance) emits a typed event that a workflow in another field (a hold in Sales, a nudge in Collections) consumes. The synapses are declarative and ride the frozen event contract, so the system can be wired into an ever-denser web of cross-field reactions without any of that wiring reaching into the core. That is how the product scales from a finance vertical to a business operating system without a rewrite.</w:t>
+      </w:r>
+    </w:p>
+    <w:p>
+      <w:pPr>
+        <w:pStyle w:val="Heading2"/>
+      </w:pPr>
+      <w:r>
+        <w:t>1A.8 The code map — where each contract lives</w:t>
+      </w:r>
+    </w:p>
+    <w:p>
+      <w:r>
+        <w:t>So the architecture is not abstract, each frozen contract and each pluggable edge has one home in the codebase. The runner port and the safety spine are the two seams that make the whole structure swappable without rework, and both exist in code today.</w:t>
+      </w:r>
+    </w:p>
+    <w:p>
+      <w:pPr>
+        <w:pStyle w:val="ListParagraph"/>
+      </w:pPr>
+      <w:r>
+        <w:t>•  Canonical model → vinayak/canonical/ and the canonical migrations (002, 010–016).</w:t>
+      </w:r>
+    </w:p>
+    <w:p>
+      <w:pPr>
+        <w:pStyle w:val="ListParagraph"/>
+      </w:pPr>
+      <w:r>
+        <w:t>•  Evidence contract → reasoning/engine.py (the Evidence record and the money tokenizers every guard shares).</w:t>
+      </w:r>
+    </w:p>
+    <w:p>
+      <w:pPr>
+        <w:pStyle w:val="ListParagraph"/>
+      </w:pPr>
+      <w:r>
+        <w:t>•  Tool contract → tools/contract.py (name, typed inputs, side-effect class, Evidence, quality).</w:t>
+      </w:r>
+    </w:p>
+    <w:p>
+      <w:pPr>
+        <w:pStyle w:val="ListParagraph"/>
+      </w:pPr>
+      <w:r>
+        <w:t>•  Safety spine → reasoning/safety.py: grounded(), confidence(), safe_summary() — one deterministic module every runner routes through.</w:t>
+      </w:r>
+    </w:p>
+    <w:p>
+      <w:pPr>
+        <w:pStyle w:val="ListParagraph"/>
+      </w:pPr>
+      <w:r>
+        <w:t>•  AgentRunner port → reasoning/runner.py: the run(trigger, context) → Answer interface, NativeAgentRunner (the owned loop) as the default, and get_runner() chosen by the AGENT_RUNNER env.</w:t>
+      </w:r>
+    </w:p>
+    <w:p>
+      <w:pPr>
+        <w:pStyle w:val="ListParagraph"/>
+      </w:pPr>
+      <w:r>
+        <w:t>•  Google ADK adapter → reasoning/adk_runner.py: a second engine behind the same port, wired but inert until opted in, and finalised through the same safety spine so it cannot loosen the guarantees.</w:t>
+      </w:r>
+    </w:p>
+    <w:p>
+      <w:pPr>
+        <w:pStyle w:val="ListParagraph"/>
+      </w:pPr>
+      <w:r>
+        <w:t>•  Memory schema → memory/store.py and memory/entity_summary.py (profile, durable facts with decay, entity summaries, threads; episodic log next).</w:t>
+      </w:r>
+    </w:p>
+    <w:p>
+      <w:pPr>
+        <w:pStyle w:val="ListParagraph"/>
+      </w:pPr>
+      <w:r>
+        <w:t>•  Event contract → the events table (migration 008), the bus the synapse workflows ride.</w:t>
+      </w:r>
+    </w:p>
+    <w:p>
+      <w:pPr>
+        <w:pStyle w:val="ListParagraph"/>
+      </w:pPr>
+      <w:r>
+        <w:t>•  Tenancy and provenance → api/routes/workspaces.py (require_workspace); company_id is injected by the layer on every read.</w:t>
+      </w:r>
+    </w:p>
+    <w:p>
+      <w:r>
+        <w:t>Swapping the orchestration engine — native loop today, Google ADK or LangGraph later — means adding one class that implements the AgentRunner interface and returning it from the factory. Tools, evidence, memory, and the safety spine are untouched. The eval harness can grade any engine (python -m vinayak.eval.harness --runner native|adk), so a swap is proven against the same scoreboard before it ships. This is the mechanism behind the no-rework guarantee in 1A.7.</w:t>
       </w:r>
     </w:p>
     <w:p>

</xml_diff>